<commit_message>
Replace agency details in template and example data with fictional values; clarify usage
</commit_message>
<xml_diff>
--- a/tenancy_template.docx
+++ b/tenancy_template.docx
@@ -457,7 +457,7 @@
           <w:bCs w:val="1"/>
           <w:rtl w:val="0"/>
         </w:rPr>
-        <w:t xml:space="preserve">MENA PROPERTY GROUP LTD</w:t>
+        <w:t xml:space="preserve">EXAMPLE LETTINGS LTD</w:t>
         <w:br w:type="textWrapping"/>
       </w:r>
       <w:r>
@@ -465,13 +465,13 @@
           <w:rFonts w:ascii="Courier New" w:cs="Courier New" w:eastAsia="Courier New" w:hAnsi="Courier New"/>
           <w:rtl w:val="0"/>
         </w:rPr>
-        <w:t xml:space="preserve">27 Old Gloucester Street</w:t>
+        <w:t xml:space="preserve">1 Example Street</w:t>
         <w:br w:type="textWrapping"/>
         <w:t xml:space="preserve">London</w:t>
         <w:br w:type="textWrapping"/>
         <w:t xml:space="preserve">United Kingdom</w:t>
         <w:br w:type="textWrapping"/>
-        <w:t xml:space="preserve">WC1N 3AX</w:t>
+        <w:t xml:space="preserve">EC1A 1AA</w:t>
       </w:r>
     </w:p>
     <w:p>
@@ -1082,7 +1082,7 @@
           <w:bCs w:val="1"/>
           <w:rtl w:val="0"/>
         </w:rPr>
-        <w:t xml:space="preserve">MENA PROPERTY GROUP LTD</w:t>
+        <w:t xml:space="preserve">EXAMPLE LETTINGS LTD</w:t>
       </w:r>
       <w:r>
         <w:rPr>
@@ -2261,7 +2261,7 @@
           <w:rFonts w:ascii="Courier New" w:cs="Courier New" w:eastAsia="Courier New" w:hAnsi="Courier New"/>
           <w:rtl w:val="0"/>
         </w:rPr>
-        <w:t xml:space="preserve"> MENA PROPERTY GROUP LTD</w:t>
+        <w:t xml:space="preserve"> EXAMPLE LETTINGS LTD</w:t>
         <w:br w:type="textWrapping"/>
       </w:r>
       <w:r>
@@ -2762,7 +2762,7 @@
           <w:bCs w:val="1"/>
           <w:rtl w:val="0"/>
         </w:rPr>
-        <w:t xml:space="preserve">MENA PROPERTY GROUP LTD</w:t>
+        <w:t xml:space="preserve">EXAMPLE LETTINGS LTD</w:t>
         <w:br w:type="textWrapping"/>
       </w:r>
       <w:r>
@@ -2770,13 +2770,13 @@
           <w:rFonts w:ascii="Courier New" w:cs="Courier New" w:eastAsia="Courier New" w:hAnsi="Courier New"/>
           <w:rtl w:val="0"/>
         </w:rPr>
-        <w:t xml:space="preserve">27 Old Gloucester Street</w:t>
+        <w:t xml:space="preserve">1 Example Street</w:t>
         <w:br w:type="textWrapping"/>
         <w:t xml:space="preserve">London</w:t>
         <w:br w:type="textWrapping"/>
         <w:t xml:space="preserve">United Kingdom</w:t>
         <w:br w:type="textWrapping"/>
-        <w:t xml:space="preserve">WC1N 3AX</w:t>
+        <w:t xml:space="preserve">EC1A 1AA</w:t>
       </w:r>
     </w:p>
     <w:p>
@@ -8497,7 +8497,7 @@
           <w:bCs w:val="1"/>
           <w:rtl w:val="0"/>
         </w:rPr>
-        <w:t xml:space="preserve">MENA PROPERTY GROUP LTD</w:t>
+        <w:t xml:space="preserve">EXAMPLE LETTINGS LTD</w:t>
         <w:br w:type="textWrapping"/>
       </w:r>
       <w:r>
@@ -8505,13 +8505,13 @@
           <w:rFonts w:ascii="Courier New" w:cs="Courier New" w:eastAsia="Courier New" w:hAnsi="Courier New"/>
           <w:rtl w:val="0"/>
         </w:rPr>
-        <w:t xml:space="preserve">27 Old Gloucester Street</w:t>
+        <w:t xml:space="preserve">1 Example Street</w:t>
         <w:br w:type="textWrapping"/>
         <w:t xml:space="preserve">London</w:t>
         <w:br w:type="textWrapping"/>
         <w:t xml:space="preserve">United Kingdom</w:t>
         <w:br w:type="textWrapping"/>
-        <w:t xml:space="preserve">WC1N 3AX</w:t>
+        <w:t xml:space="preserve">EC1A 1AA</w:t>
       </w:r>
     </w:p>
     <w:p>
@@ -9506,7 +9506,7 @@
           <w:bCs w:val="1"/>
           <w:rtl w:val="0"/>
         </w:rPr>
-        <w:t xml:space="preserve">For and on behalf of MENA PROPERTY GROUP LTD</w:t>
+        <w:t xml:space="preserve">For and on behalf of EXAMPLE LETTINGS LTD</w:t>
       </w:r>
     </w:p>
     <w:p>
@@ -9975,7 +9975,7 @@
           <w:bCs w:val="1"/>
           <w:rtl w:val="0"/>
         </w:rPr>
-        <w:t xml:space="preserve">MENA PROPERTY GROUP LTD</w:t>
+        <w:t xml:space="preserve">EXAMPLE LETTINGS LTD</w:t>
         <w:br w:type="textWrapping"/>
       </w:r>
       <w:r>
@@ -9983,13 +9983,13 @@
           <w:rFonts w:ascii="Courier New" w:cs="Courier New" w:eastAsia="Courier New" w:hAnsi="Courier New"/>
           <w:rtl w:val="0"/>
         </w:rPr>
-        <w:t xml:space="preserve">27 Old Gloucester Street</w:t>
+        <w:t xml:space="preserve">1 Example Street</w:t>
         <w:br w:type="textWrapping"/>
         <w:t xml:space="preserve">London</w:t>
         <w:br w:type="textWrapping"/>
         <w:t xml:space="preserve">United Kingdom</w:t>
         <w:br w:type="textWrapping"/>
-        <w:t xml:space="preserve">WC1N 3AX</w:t>
+        <w:t xml:space="preserve">EC1A 1AA</w:t>
       </w:r>
     </w:p>
     <w:p>

</xml_diff>